<commit_message>
crated train_logi  runly and train_random_forest
</commit_message>
<xml_diff>
--- a/notes/Dataset Pipeline Documentation.docx
+++ b/notes/Dataset Pipeline Documentation.docx
@@ -2151,11 +2151,14 @@
     <w:p>
       <w:pPr>
         <w:pStyle w:val="50"/>
-      </w:pPr>
-      <w:r>
         <w:rPr>
           <w:rStyle w:val="49"/>
         </w:rPr>
+      </w:pPr>
+      <w:r>
+        <w:rPr>
+          <w:rStyle w:val="49"/>
+        </w:rPr>
         <w:t>Copy codesrc/validation/</w:t>
       </w:r>
       <w:r>
@@ -2179,17 +2182,10 @@
     </w:p>
     <w:p>
       <w:pPr>
-        <w:pStyle w:val="24"/>
-      </w:pPr>
-    </w:p>
-    <w:p>
-      <w:pPr>
-        <w:pStyle w:val="3"/>
-      </w:pPr>
-    </w:p>
-    <w:p>
-      <w:pPr>
-        <w:pStyle w:val="3"/>
+        <w:pStyle w:val="50"/>
+        <w:rPr>
+          <w:rStyle w:val="49"/>
+        </w:rPr>
       </w:pPr>
     </w:p>
     <w:p>
@@ -2245,11 +2241,38 @@
         <w:shd w:val="clear" w:fill="92D050"/>
         <w:rPr>
           <w:rFonts w:hint="default"/>
+          <w:shd w:val="clear"/>
+          <w:lang w:val="en-US"/>
+        </w:rPr>
+      </w:pPr>
+    </w:p>
+    <w:p>
+      <w:pPr>
+        <w:pStyle w:val="50"/>
+        <w:rPr>
+          <w:rStyle w:val="49"/>
+        </w:rPr>
+      </w:pPr>
+    </w:p>
+    <w:p>
+      <w:pPr>
+        <w:pStyle w:val="50"/>
+        <w:rPr>
+          <w:rStyle w:val="49"/>
+          <w:rFonts w:hint="default"/>
           <w:lang w:val="en-US"/>
         </w:rPr>
       </w:pPr>
       <w:bookmarkStart w:id="0" w:name="_GoBack"/>
       <w:bookmarkEnd w:id="0"/>
+      <w:r>
+        <w:rPr>
+          <w:rStyle w:val="49"/>
+          <w:rFonts w:hint="default"/>
+          <w:lang w:val="en-US"/>
+        </w:rPr>
+        <w:t>adaf</w:t>
+      </w:r>
     </w:p>
     <w:sectPr>
       <w:footnotePr>
@@ -2626,7 +2649,7 @@
     <w:lsdException w:unhideWhenUsed="0" w:uiPriority="0" w:semiHidden="0" w:name="Document Map"/>
     <w:lsdException w:unhideWhenUsed="0" w:uiPriority="0" w:semiHidden="0" w:name="Plain Text"/>
     <w:lsdException w:unhideWhenUsed="0" w:uiPriority="0" w:semiHidden="0" w:name="E-mail Signature"/>
-    <w:lsdException w:unhideWhenUsed="0" w:uiPriority="0" w:semiHidden="0" w:name="Normal (Web)"/>
+    <w:lsdException w:qFormat="1" w:unhideWhenUsed="0" w:uiPriority="0" w:semiHidden="0" w:name="Normal (Web)"/>
     <w:lsdException w:unhideWhenUsed="0" w:uiPriority="0" w:semiHidden="0" w:name="HTML Acronym"/>
     <w:lsdException w:unhideWhenUsed="0" w:uiPriority="0" w:semiHidden="0" w:name="HTML Address"/>
     <w:lsdException w:unhideWhenUsed="0" w:uiPriority="0" w:semiHidden="0" w:name="HTML Cite"/>
@@ -2637,7 +2660,7 @@
     <w:lsdException w:unhideWhenUsed="0" w:uiPriority="0" w:semiHidden="0" w:name="HTML Sample"/>
     <w:lsdException w:unhideWhenUsed="0" w:uiPriority="0" w:semiHidden="0" w:name="HTML Typewriter"/>
     <w:lsdException w:unhideWhenUsed="0" w:uiPriority="0" w:semiHidden="0" w:name="HTML Variable"/>
-    <w:lsdException w:unhideWhenUsed="0" w:uiPriority="0" w:semiHidden="0" w:name="Normal Table"/>
+    <w:lsdException w:qFormat="1" w:unhideWhenUsed="0" w:uiPriority="0" w:semiHidden="0" w:name="Normal Table"/>
     <w:lsdException w:unhideWhenUsed="0" w:uiPriority="0" w:semiHidden="0" w:name="annotation subject"/>
     <w:lsdException w:unhideWhenUsed="0" w:uiPriority="0" w:semiHidden="0" w:name="Table Simple 1"/>
     <w:lsdException w:unhideWhenUsed="0" w:uiPriority="0" w:semiHidden="0" w:name="Table Simple 2"/>
@@ -2995,6 +3018,7 @@
   </w:style>
   <w:style w:type="table" w:default="1" w:styleId="13">
     <w:name w:val="Normal Table"/>
+    <w:qFormat/>
     <w:uiPriority w:val="0"/>
     <w:tblPr>
       <w:tblCellMar>
@@ -3106,6 +3130,7 @@
   </w:style>
   <w:style w:type="paragraph" w:styleId="22">
     <w:name w:val="Normal (Web)"/>
+    <w:qFormat/>
     <w:uiPriority w:val="0"/>
     <w:pPr>
       <w:spacing w:before="0" w:beforeAutospacing="1" w:after="0" w:afterAutospacing="1"/>
@@ -3113,6 +3138,7 @@
       <w:jc w:val="left"/>
     </w:pPr>
     <w:rPr>
+      <w:rFonts w:ascii="Times New Roman" w:hAnsi="Times New Roman" w:eastAsia="SimSun" w:cs="Times New Roman"/>
       <w:kern w:val="0"/>
       <w:sz w:val="24"/>
       <w:szCs w:val="24"/>
@@ -3153,6 +3179,7 @@
     <w:name w:val="Title Char"/>
     <w:basedOn w:val="12"/>
     <w:link w:val="17"/>
+    <w:qFormat/>
     <w:uiPriority w:val="10"/>
     <w:rPr>
       <w:rFonts w:asciiTheme="majorHAnsi" w:hAnsiTheme="majorHAnsi" w:eastAsiaTheme="majorEastAsia" w:cstheme="majorBidi"/>
@@ -3164,6 +3191,7 @@
     <w:name w:val="Subtitle Char"/>
     <w:basedOn w:val="12"/>
     <w:link w:val="23"/>
+    <w:qFormat/>
     <w:uiPriority w:val="11"/>
     <w:rPr>
       <w:rFonts w:eastAsiaTheme="majorEastAsia" w:cstheme="majorBidi"/>
@@ -3232,6 +3260,7 @@
     <w:name w:val="Heading 1 Char"/>
     <w:basedOn w:val="12"/>
     <w:link w:val="2"/>
+    <w:qFormat/>
     <w:uiPriority w:val="9"/>
     <w:rPr>
       <w:rFonts w:asciiTheme="majorHAnsi" w:hAnsiTheme="majorHAnsi" w:eastAsiaTheme="majorEastAsia" w:cstheme="majorBidi"/>
@@ -3259,6 +3288,7 @@
     <w:basedOn w:val="12"/>
     <w:link w:val="5"/>
     <w:semiHidden/>
+    <w:qFormat/>
     <w:uiPriority w:val="9"/>
     <w:rPr>
       <w:rFonts w:eastAsiaTheme="majorEastAsia" w:cstheme="majorBidi"/>
@@ -3272,6 +3302,7 @@
     <w:basedOn w:val="12"/>
     <w:link w:val="6"/>
     <w:semiHidden/>
+    <w:qFormat/>
     <w:uiPriority w:val="9"/>
     <w:rPr>
       <w:rFonts w:eastAsiaTheme="majorEastAsia" w:cstheme="majorBidi"/>
@@ -3285,6 +3316,7 @@
     <w:basedOn w:val="12"/>
     <w:link w:val="7"/>
     <w:semiHidden/>
+    <w:qFormat/>
     <w:uiPriority w:val="9"/>
     <w:rPr>
       <w:rFonts w:eastAsiaTheme="majorEastAsia" w:cstheme="majorBidi"/>
@@ -3296,6 +3328,7 @@
     <w:basedOn w:val="12"/>
     <w:link w:val="8"/>
     <w:semiHidden/>
+    <w:qFormat/>
     <w:uiPriority w:val="9"/>
     <w:rPr>
       <w:rFonts w:eastAsiaTheme="majorEastAsia" w:cstheme="majorBidi"/>
@@ -3309,6 +3342,7 @@
     <w:basedOn w:val="12"/>
     <w:link w:val="9"/>
     <w:semiHidden/>
+    <w:qFormat/>
     <w:uiPriority w:val="9"/>
     <w:rPr>
       <w:rFonts w:eastAsiaTheme="majorEastAsia" w:cstheme="majorBidi"/>
@@ -3320,6 +3354,7 @@
     <w:basedOn w:val="12"/>
     <w:link w:val="10"/>
     <w:semiHidden/>
+    <w:qFormat/>
     <w:uiPriority w:val="9"/>
     <w:rPr>
       <w:rFonts w:eastAsiaTheme="majorEastAsia" w:cstheme="majorBidi"/>
@@ -3333,6 +3368,7 @@
     <w:basedOn w:val="12"/>
     <w:link w:val="11"/>
     <w:semiHidden/>
+    <w:qFormat/>
     <w:uiPriority w:val="9"/>
     <w:rPr>
       <w:rFonts w:eastAsiaTheme="majorEastAsia" w:cstheme="majorBidi"/>
@@ -3378,6 +3414,7 @@
     <w:name w:val="Definition Term"/>
     <w:basedOn w:val="1"/>
     <w:next w:val="44"/>
+    <w:qFormat/>
     <w:uiPriority w:val="0"/>
     <w:pPr>
       <w:keepNext/>
@@ -3391,11 +3428,13 @@
   <w:style w:type="paragraph" w:customStyle="1" w:styleId="44">
     <w:name w:val="Definition"/>
     <w:basedOn w:val="1"/>
+    <w:qFormat/>
     <w:uiPriority w:val="0"/>
   </w:style>
   <w:style w:type="paragraph" w:customStyle="1" w:styleId="45">
     <w:name w:val="Table Caption"/>
     <w:basedOn w:val="15"/>
+    <w:qFormat/>
     <w:uiPriority w:val="0"/>
     <w:pPr>
       <w:keepNext/>
@@ -3404,16 +3443,19 @@
   <w:style w:type="paragraph" w:customStyle="1" w:styleId="46">
     <w:name w:val="Image Caption"/>
     <w:basedOn w:val="15"/>
+    <w:qFormat/>
     <w:uiPriority w:val="0"/>
   </w:style>
   <w:style w:type="paragraph" w:customStyle="1" w:styleId="47">
     <w:name w:val="Figure"/>
     <w:basedOn w:val="1"/>
+    <w:qFormat/>
     <w:uiPriority w:val="0"/>
   </w:style>
   <w:style w:type="paragraph" w:customStyle="1" w:styleId="48">
     <w:name w:val="Captioned Figure"/>
     <w:basedOn w:val="47"/>
+    <w:qFormat/>
     <w:uiPriority w:val="0"/>
     <w:pPr>
       <w:keepNext/>
@@ -3434,6 +3476,7 @@
     <w:name w:val="Source Code"/>
     <w:basedOn w:val="1"/>
     <w:link w:val="49"/>
+    <w:qFormat/>
     <w:uiPriority w:val="0"/>
     <w:pPr>
       <w:wordWrap w:val="0"/>
@@ -3442,6 +3485,7 @@
   <w:style w:type="character" w:customStyle="1" w:styleId="51">
     <w:name w:val="Section Number"/>
     <w:basedOn w:val="19"/>
+    <w:qFormat/>
     <w:uiPriority w:val="0"/>
   </w:style>
   <w:style w:type="paragraph" w:customStyle="1" w:styleId="52">
@@ -3463,6 +3507,7 @@
   <w:style w:type="character" w:customStyle="1" w:styleId="53">
     <w:name w:val="KeywordTok"/>
     <w:basedOn w:val="49"/>
+    <w:qFormat/>
     <w:uiPriority w:val="0"/>
     <w:rPr>
       <w:b/>
@@ -3472,6 +3517,7 @@
   <w:style w:type="character" w:customStyle="1" w:styleId="54">
     <w:name w:val="DataTypeTok"/>
     <w:basedOn w:val="49"/>
+    <w:qFormat/>
     <w:uiPriority w:val="0"/>
     <w:rPr>
       <w:color w:val="902000"/>
@@ -3480,6 +3526,7 @@
   <w:style w:type="character" w:customStyle="1" w:styleId="55">
     <w:name w:val="DecValTok"/>
     <w:basedOn w:val="49"/>
+    <w:qFormat/>
     <w:uiPriority w:val="0"/>
     <w:rPr>
       <w:color w:val="40A070"/>
@@ -3488,6 +3535,7 @@
   <w:style w:type="character" w:customStyle="1" w:styleId="56">
     <w:name w:val="BaseNTok"/>
     <w:basedOn w:val="49"/>
+    <w:qFormat/>
     <w:uiPriority w:val="0"/>
     <w:rPr>
       <w:color w:val="40A070"/>
@@ -3496,6 +3544,7 @@
   <w:style w:type="character" w:customStyle="1" w:styleId="57">
     <w:name w:val="FloatTok"/>
     <w:basedOn w:val="49"/>
+    <w:qFormat/>
     <w:uiPriority w:val="0"/>
     <w:rPr>
       <w:color w:val="40A070"/>
@@ -3512,6 +3561,7 @@
   <w:style w:type="character" w:customStyle="1" w:styleId="59">
     <w:name w:val="CharTok"/>
     <w:basedOn w:val="49"/>
+    <w:qFormat/>
     <w:uiPriority w:val="0"/>
     <w:rPr>
       <w:color w:val="4070A0"/>
@@ -3520,6 +3570,7 @@
   <w:style w:type="character" w:customStyle="1" w:styleId="60">
     <w:name w:val="SpecialCharTok"/>
     <w:basedOn w:val="49"/>
+    <w:qFormat/>
     <w:uiPriority w:val="0"/>
     <w:rPr>
       <w:color w:val="4070A0"/>
@@ -3528,6 +3579,7 @@
   <w:style w:type="character" w:customStyle="1" w:styleId="61">
     <w:name w:val="StringTok"/>
     <w:basedOn w:val="49"/>
+    <w:qFormat/>
     <w:uiPriority w:val="0"/>
     <w:rPr>
       <w:color w:val="4070A0"/>
@@ -3536,6 +3588,7 @@
   <w:style w:type="character" w:customStyle="1" w:styleId="62">
     <w:name w:val="VerbatimStringTok"/>
     <w:basedOn w:val="49"/>
+    <w:qFormat/>
     <w:uiPriority w:val="0"/>
     <w:rPr>
       <w:color w:val="4070A0"/>
@@ -3544,6 +3597,7 @@
   <w:style w:type="character" w:customStyle="1" w:styleId="63">
     <w:name w:val="SpecialStringTok"/>
     <w:basedOn w:val="49"/>
+    <w:qFormat/>
     <w:uiPriority w:val="0"/>
     <w:rPr>
       <w:color w:val="BB6688"/>
@@ -3552,6 +3606,7 @@
   <w:style w:type="character" w:customStyle="1" w:styleId="64">
     <w:name w:val="ImportTok"/>
     <w:basedOn w:val="49"/>
+    <w:qFormat/>
     <w:uiPriority w:val="0"/>
     <w:rPr>
       <w:b/>
@@ -3561,6 +3616,7 @@
   <w:style w:type="character" w:customStyle="1" w:styleId="65">
     <w:name w:val="CommentTok"/>
     <w:basedOn w:val="49"/>
+    <w:qFormat/>
     <w:uiPriority w:val="0"/>
     <w:rPr>
       <w:i/>
@@ -3579,6 +3635,7 @@
   <w:style w:type="character" w:customStyle="1" w:styleId="67">
     <w:name w:val="AnnotationTok"/>
     <w:basedOn w:val="49"/>
+    <w:qFormat/>
     <w:uiPriority w:val="0"/>
     <w:rPr>
       <w:b/>
@@ -3589,6 +3646,7 @@
   <w:style w:type="character" w:customStyle="1" w:styleId="68">
     <w:name w:val="CommentVarTok"/>
     <w:basedOn w:val="49"/>
+    <w:qFormat/>
     <w:uiPriority w:val="0"/>
     <w:rPr>
       <w:b/>
@@ -3599,6 +3657,7 @@
   <w:style w:type="character" w:customStyle="1" w:styleId="69">
     <w:name w:val="OtherTok"/>
     <w:basedOn w:val="49"/>
+    <w:qFormat/>
     <w:uiPriority w:val="0"/>
     <w:rPr>
       <w:color w:val="007020"/>
@@ -3607,6 +3666,7 @@
   <w:style w:type="character" w:customStyle="1" w:styleId="70">
     <w:name w:val="FunctionTok"/>
     <w:basedOn w:val="49"/>
+    <w:qFormat/>
     <w:uiPriority w:val="0"/>
     <w:rPr>
       <w:color w:val="06287E"/>
@@ -3615,6 +3675,7 @@
   <w:style w:type="character" w:customStyle="1" w:styleId="71">
     <w:name w:val="VariableTok"/>
     <w:basedOn w:val="49"/>
+    <w:qFormat/>
     <w:uiPriority w:val="0"/>
     <w:rPr>
       <w:color w:val="19177C"/>
@@ -3623,6 +3684,7 @@
   <w:style w:type="character" w:customStyle="1" w:styleId="72">
     <w:name w:val="ControlFlowTok"/>
     <w:basedOn w:val="49"/>
+    <w:qFormat/>
     <w:uiPriority w:val="0"/>
     <w:rPr>
       <w:b/>
@@ -3632,6 +3694,7 @@
   <w:style w:type="character" w:customStyle="1" w:styleId="73">
     <w:name w:val="OperatorTok"/>
     <w:basedOn w:val="49"/>
+    <w:qFormat/>
     <w:uiPriority w:val="0"/>
     <w:rPr>
       <w:color w:val="666666"/>
@@ -3640,6 +3703,7 @@
   <w:style w:type="character" w:customStyle="1" w:styleId="74">
     <w:name w:val="BuiltInTok"/>
     <w:basedOn w:val="49"/>
+    <w:qFormat/>
     <w:uiPriority w:val="0"/>
     <w:rPr>
       <w:color w:val="008000"/>
@@ -3648,11 +3712,13 @@
   <w:style w:type="character" w:customStyle="1" w:styleId="75">
     <w:name w:val="ExtensionTok"/>
     <w:basedOn w:val="49"/>
+    <w:qFormat/>
     <w:uiPriority w:val="0"/>
   </w:style>
   <w:style w:type="character" w:customStyle="1" w:styleId="76">
     <w:name w:val="PreprocessorTok"/>
     <w:basedOn w:val="49"/>
+    <w:qFormat/>
     <w:uiPriority w:val="0"/>
     <w:rPr>
       <w:color w:val="BC7A00"/>
@@ -3661,6 +3727,7 @@
   <w:style w:type="character" w:customStyle="1" w:styleId="77">
     <w:name w:val="AttributeTok"/>
     <w:basedOn w:val="49"/>
+    <w:qFormat/>
     <w:uiPriority w:val="0"/>
     <w:rPr>
       <w:color w:val="7D9029"/>
@@ -3674,6 +3741,7 @@
   <w:style w:type="character" w:customStyle="1" w:styleId="79">
     <w:name w:val="InformationTok"/>
     <w:basedOn w:val="49"/>
+    <w:qFormat/>
     <w:uiPriority w:val="0"/>
     <w:rPr>
       <w:b/>
@@ -3684,6 +3752,7 @@
   <w:style w:type="character" w:customStyle="1" w:styleId="80">
     <w:name w:val="WarningTok"/>
     <w:basedOn w:val="49"/>
+    <w:qFormat/>
     <w:uiPriority w:val="0"/>
     <w:rPr>
       <w:b/>
@@ -3694,6 +3763,7 @@
   <w:style w:type="character" w:customStyle="1" w:styleId="81">
     <w:name w:val="AlertTok"/>
     <w:basedOn w:val="49"/>
+    <w:qFormat/>
     <w:uiPriority w:val="0"/>
     <w:rPr>
       <w:b/>
@@ -3703,6 +3773,7 @@
   <w:style w:type="character" w:customStyle="1" w:styleId="82">
     <w:name w:val="ErrorTok"/>
     <w:basedOn w:val="49"/>
+    <w:qFormat/>
     <w:uiPriority w:val="0"/>
     <w:rPr>
       <w:b/>
@@ -3712,6 +3783,7 @@
   <w:style w:type="character" w:customStyle="1" w:styleId="83">
     <w:name w:val="NormalTok"/>
     <w:basedOn w:val="49"/>
+    <w:qFormat/>
     <w:uiPriority w:val="0"/>
   </w:style>
 </w:styles>

</xml_diff>

<commit_message>
updated requirement by adding pip install dash dash-leaflet geopandas shapely
</commit_message>
<xml_diff>
--- a/notes/Dataset Pipeline Documentation.docx
+++ b/notes/Dataset Pipeline Documentation.docx
@@ -132,9 +132,9 @@
         </w:tblCellMar>
       </w:tblPr>
       <w:tblGrid>
-        <w:gridCol w:w="1103"/>
-        <w:gridCol w:w="1525"/>
-        <w:gridCol w:w="1999"/>
+        <w:gridCol w:w="1176"/>
+        <w:gridCol w:w="1421"/>
+        <w:gridCol w:w="1733"/>
       </w:tblGrid>
       <w:tr>
         <w:tblPrEx>
@@ -623,8 +623,8 @@
         </w:tblCellMar>
       </w:tblPr>
       <w:tblGrid>
-        <w:gridCol w:w="2010"/>
-        <w:gridCol w:w="1895"/>
+        <w:gridCol w:w="1733"/>
+        <w:gridCol w:w="1803"/>
       </w:tblGrid>
       <w:tr>
         <w:tblPrEx>
@@ -2263,16 +2263,59 @@
           <w:lang w:val="en-US"/>
         </w:rPr>
       </w:pPr>
-      <w:bookmarkStart w:id="0" w:name="_GoBack"/>
-      <w:bookmarkEnd w:id="0"/>
       <w:r>
         <w:rPr>
           <w:rStyle w:val="49"/>
           <w:rFonts w:hint="default"/>
           <w:lang w:val="en-US"/>
         </w:rPr>
-        <w:t>adaf</w:t>
-      </w:r>
+        <w:br w:type="page"/>
+      </w:r>
+      <w:r>
+        <w:drawing>
+          <wp:inline distT="0" distB="0" distL="114300" distR="114300">
+            <wp:extent cx="5485130" cy="2486025"/>
+            <wp:effectExtent l="0" t="0" r="1270" b="9525"/>
+            <wp:docPr id="1" name="Picture 18"/>
+            <wp:cNvGraphicFramePr>
+              <a:graphicFrameLocks xmlns:a="http://schemas.openxmlformats.org/drawingml/2006/main" noChangeAspect="1"/>
+            </wp:cNvGraphicFramePr>
+            <a:graphic xmlns:a="http://schemas.openxmlformats.org/drawingml/2006/main">
+              <a:graphicData uri="http://schemas.openxmlformats.org/drawingml/2006/picture">
+                <pic:pic xmlns:pic="http://schemas.openxmlformats.org/drawingml/2006/picture">
+                  <pic:nvPicPr>
+                    <pic:cNvPr id="1" name="Picture 18"/>
+                    <pic:cNvPicPr>
+                      <a:picLocks noChangeAspect="1"/>
+                    </pic:cNvPicPr>
+                  </pic:nvPicPr>
+                  <pic:blipFill>
+                    <a:blip r:embed="rId5"/>
+                    <a:stretch>
+                      <a:fillRect/>
+                    </a:stretch>
+                  </pic:blipFill>
+                  <pic:spPr>
+                    <a:xfrm>
+                      <a:off x="0" y="0"/>
+                      <a:ext cx="5485130" cy="2486025"/>
+                    </a:xfrm>
+                    <a:prstGeom prst="rect">
+                      <a:avLst/>
+                    </a:prstGeom>
+                    <a:noFill/>
+                    <a:ln>
+                      <a:noFill/>
+                    </a:ln>
+                  </pic:spPr>
+                </pic:pic>
+              </a:graphicData>
+            </a:graphic>
+          </wp:inline>
+        </w:drawing>
+      </w:r>
+      <w:bookmarkStart w:id="0" w:name="_GoBack"/>
+      <w:bookmarkEnd w:id="0"/>
     </w:p>
     <w:sectPr>
       <w:footnotePr>
@@ -2591,7 +2634,7 @@
     <w:lsdException w:unhideWhenUsed="0" w:uiPriority="0" w:semiHidden="0" w:name="header"/>
     <w:lsdException w:unhideWhenUsed="0" w:uiPriority="0" w:semiHidden="0" w:name="footer"/>
     <w:lsdException w:unhideWhenUsed="0" w:uiPriority="0" w:semiHidden="0" w:name="index heading"/>
-    <w:lsdException w:unhideWhenUsed="0" w:uiPriority="0" w:semiHidden="0" w:name="caption"/>
+    <w:lsdException w:qFormat="1" w:unhideWhenUsed="0" w:uiPriority="0" w:semiHidden="0" w:name="caption"/>
     <w:lsdException w:unhideWhenUsed="0" w:uiPriority="0" w:semiHidden="0" w:name="table of figures"/>
     <w:lsdException w:unhideWhenUsed="0" w:uiPriority="0" w:semiHidden="0" w:name="envelope address"/>
     <w:lsdException w:unhideWhenUsed="0" w:uiPriority="0" w:semiHidden="0" w:name="envelope return"/>
@@ -2622,7 +2665,7 @@
     <w:lsdException w:qFormat="1" w:unhideWhenUsed="0" w:uiPriority="10" w:semiHidden="0" w:name="Title"/>
     <w:lsdException w:unhideWhenUsed="0" w:uiPriority="0" w:semiHidden="0" w:name="Closing"/>
     <w:lsdException w:unhideWhenUsed="0" w:uiPriority="0" w:semiHidden="0" w:name="Signature"/>
-    <w:lsdException w:uiPriority="0" w:name="Default Paragraph Font"/>
+    <w:lsdException w:qFormat="1" w:uiPriority="0" w:name="Default Paragraph Font"/>
     <w:lsdException w:qFormat="1" w:unhideWhenUsed="0" w:uiPriority="0" w:semiHidden="0" w:name="Body Text"/>
     <w:lsdException w:unhideWhenUsed="0" w:uiPriority="0" w:semiHidden="0" w:name="Body Text Indent"/>
     <w:lsdException w:unhideWhenUsed="0" w:uiPriority="0" w:semiHidden="0" w:name="List Continue"/>
@@ -3014,6 +3057,7 @@
     <w:name w:val="Default Paragraph Font"/>
     <w:semiHidden/>
     <w:unhideWhenUsed/>
+    <w:qFormat/>
     <w:uiPriority w:val="0"/>
   </w:style>
   <w:style w:type="table" w:default="1" w:styleId="13">
@@ -3055,6 +3099,7 @@
     <w:name w:val="caption"/>
     <w:basedOn w:val="1"/>
     <w:next w:val="1"/>
+    <w:qFormat/>
     <w:uiPriority w:val="0"/>
     <w:pPr>
       <w:spacing w:before="0" w:after="120"/>
@@ -3553,6 +3598,7 @@
   <w:style w:type="character" w:customStyle="1" w:styleId="58">
     <w:name w:val="ConstantTok"/>
     <w:basedOn w:val="49"/>
+    <w:qFormat/>
     <w:uiPriority w:val="0"/>
     <w:rPr>
       <w:color w:val="880000"/>
@@ -3626,6 +3672,7 @@
   <w:style w:type="character" w:customStyle="1" w:styleId="66">
     <w:name w:val="DocumentationTok"/>
     <w:basedOn w:val="49"/>
+    <w:qFormat/>
     <w:uiPriority w:val="0"/>
     <w:rPr>
       <w:i/>

</xml_diff>